<commit_message>
feat: add software-lifecycle method
Adds software lifecycle as the ninth tool: a method, checklist, SOP, platform guide, Copilot test, template and synthetic example. It runs the offline software-lifecycle tool pinned to v0.7.0 and relays summary counts only. The Claude app and ChatGPT are marked unsupported.

Fixes #33

Co-Authored-By: Claude Sonnet 5.5 <noreply@anthropic.com>
Claude-Session: https://claude.ai/code/session_011jjas1nbTyQijgNwgRkSB9
</commit_message>
<xml_diff>
--- a/site/docs/app-governance/method.docx
+++ b/site/docs/app-governance/method.docx
@@ -464,6 +464,41 @@
                 <w:rFonts w:ascii="Consolas" w:hAnsi="Consolas"/>
               </w:rPr>
               <w:t xml:space="preserve">hardware-lifecycle</w:t>
+            </w:r>
+          </w:p>
+        </w:tc>
+      </w:tr>
+      <w:tr>
+        <w:trPr>
+          <w:cantSplit/>
+          <w:trHeight w:val="480" w:hRule="atLeast"/>
+        </w:trPr>
+        <w:tc>
+          <w:tcPr>
+            <w:tcW w:w="5040" w:type="dxa"/>
+          </w:tcPr>
+          <w:p>
+            <w:pPr>
+              <w:spacing w:after="0"/>
+            </w:pPr>
+            <w:r>
+              <w:t xml:space="preserve">Find installed software past or near end of life, with a CISA KEV needs-review flag, from a software inventory export: counts only, run on the person's own machine</w:t>
+            </w:r>
+          </w:p>
+        </w:tc>
+        <w:tc>
+          <w:tcPr>
+            <w:tcW w:w="5040" w:type="dxa"/>
+          </w:tcPr>
+          <w:p>
+            <w:pPr>
+              <w:spacing w:after="0"/>
+            </w:pPr>
+            <w:r>
+              <w:rPr>
+                <w:rFonts w:ascii="Consolas" w:hAnsi="Consolas"/>
+              </w:rPr>
+              <w:t xml:space="preserve">software-lifecycle</w:t>
             </w:r>
           </w:p>
         </w:tc>

</xml_diff>